<commit_message>
Documentación: auditoría de seguridad, pruebas y despliegue
Actualiza los tres documentos con los cambios de esta iteración:
correcciones de control de acceso, límite de peticiones, paginación
acotada, búsqueda, las 37 pruebas automatizadas y el despliegue en la nube.

Reescribe el README con la guía de despliegue en Vercel y Render.

Co-Authored-By: Claude Fable 5 <noreply@anthropic.com>
</commit_message>
<xml_diff>
--- a/docs/UrbanLog - Administracion de Proyectos.docx
+++ b/docs/UrbanLog - Administracion de Proyectos.docx
@@ -1085,7 +1085,7 @@
           <w:sz w:val="22"/>
           <w:szCs w:val="22"/>
         </w:rPr>
-        <w:t xml:space="preserve">Despliegue productivo en la nube: la aplicación se ejecuta y se demuestra en entorno local, si bien la configuración por variables de entorno la deja preparada para su despliegue.</w:t>
+        <w:t xml:space="preserve">Dominio propio y certificado personalizado: se utilizan los dominios que proveen las plataformas de despliegue.</w:t>
       </w:r>
     </w:p>
     <w:p>
@@ -2674,6 +2674,312 @@
           <w:tcPr>
             <w:tcW w:type="dxa" w:w="2276"/>
             <w:shd w:fill="F2F5F9" w:val="clear"/>
+            <w:tcMar>
+              <w:top w:type="dxa" w:w="70"/>
+              <w:left w:type="dxa" w:w="110"/>
+              <w:bottom w:type="dxa" w:w="70"/>
+              <w:right w:type="dxa" w:w="110"/>
+            </w:tcMar>
+          </w:tcPr>
+          <w:p>
+            <w:pPr>
+              <w:spacing w:after="0" w:line="250"/>
+            </w:pPr>
+            <w:r>
+              <w:rPr>
+                <w:color w:val="000000"/>
+                <w:sz w:val="20"/>
+                <w:szCs w:val="20"/>
+              </w:rPr>
+              <w:t xml:space="preserve">Implementada</w:t>
+            </w:r>
+          </w:p>
+        </w:tc>
+      </w:tr>
+      <w:tr>
+        <w:tc>
+          <w:tcPr>
+            <w:tcW w:type="dxa" w:w="900"/>
+            <w:shd w:fill="FFFFFF" w:val="clear"/>
+            <w:tcMar>
+              <w:top w:type="dxa" w:w="70"/>
+              <w:left w:type="dxa" w:w="110"/>
+              <w:bottom w:type="dxa" w:w="70"/>
+              <w:right w:type="dxa" w:w="110"/>
+            </w:tcMar>
+          </w:tcPr>
+          <w:p>
+            <w:pPr>
+              <w:spacing w:after="0" w:line="250"/>
+            </w:pPr>
+            <w:r>
+              <w:rPr>
+                <w:color w:val="000000"/>
+                <w:sz w:val="20"/>
+                <w:szCs w:val="20"/>
+              </w:rPr>
+              <w:t xml:space="preserve">HU37</w:t>
+            </w:r>
+          </w:p>
+        </w:tc>
+        <w:tc>
+          <w:tcPr>
+            <w:tcW w:type="dxa" w:w="4700"/>
+            <w:shd w:fill="FFFFFF" w:val="clear"/>
+            <w:tcMar>
+              <w:top w:type="dxa" w:w="70"/>
+              <w:left w:type="dxa" w:w="110"/>
+              <w:bottom w:type="dxa" w:w="70"/>
+              <w:right w:type="dxa" w:w="110"/>
+            </w:tcMar>
+          </w:tcPr>
+          <w:p>
+            <w:pPr>
+              <w:spacing w:after="0" w:line="250"/>
+            </w:pPr>
+            <w:r>
+              <w:rPr>
+                <w:color w:val="000000"/>
+                <w:sz w:val="20"/>
+                <w:szCs w:val="20"/>
+              </w:rPr>
+              <w:t xml:space="preserve">Como ciudadano quiero buscar incidentes por título, descripción o dirección para encontrar rápidamente un problema concreto.</w:t>
+            </w:r>
+          </w:p>
+        </w:tc>
+        <w:tc>
+          <w:tcPr>
+            <w:tcW w:type="dxa" w:w="1150"/>
+            <w:shd w:fill="FFFFFF" w:val="clear"/>
+            <w:tcMar>
+              <w:top w:type="dxa" w:w="70"/>
+              <w:left w:type="dxa" w:w="110"/>
+              <w:bottom w:type="dxa" w:w="70"/>
+              <w:right w:type="dxa" w:w="110"/>
+            </w:tcMar>
+          </w:tcPr>
+          <w:p>
+            <w:pPr>
+              <w:spacing w:after="0" w:line="250"/>
+            </w:pPr>
+            <w:r>
+              <w:rPr>
+                <w:color w:val="000000"/>
+                <w:sz w:val="20"/>
+                <w:szCs w:val="20"/>
+              </w:rPr>
+              <w:t xml:space="preserve">Media</w:t>
+            </w:r>
+          </w:p>
+        </w:tc>
+        <w:tc>
+          <w:tcPr>
+            <w:tcW w:type="dxa" w:w="2276"/>
+            <w:shd w:fill="FFFFFF" w:val="clear"/>
+            <w:tcMar>
+              <w:top w:type="dxa" w:w="70"/>
+              <w:left w:type="dxa" w:w="110"/>
+              <w:bottom w:type="dxa" w:w="70"/>
+              <w:right w:type="dxa" w:w="110"/>
+            </w:tcMar>
+          </w:tcPr>
+          <w:p>
+            <w:pPr>
+              <w:spacing w:after="0" w:line="250"/>
+            </w:pPr>
+            <w:r>
+              <w:rPr>
+                <w:color w:val="000000"/>
+                <w:sz w:val="20"/>
+                <w:szCs w:val="20"/>
+              </w:rPr>
+              <w:t xml:space="preserve">Implementada</w:t>
+            </w:r>
+          </w:p>
+        </w:tc>
+      </w:tr>
+      <w:tr>
+        <w:tc>
+          <w:tcPr>
+            <w:tcW w:type="dxa" w:w="900"/>
+            <w:shd w:fill="F2F5F9" w:val="clear"/>
+            <w:tcMar>
+              <w:top w:type="dxa" w:w="70"/>
+              <w:left w:type="dxa" w:w="110"/>
+              <w:bottom w:type="dxa" w:w="70"/>
+              <w:right w:type="dxa" w:w="110"/>
+            </w:tcMar>
+          </w:tcPr>
+          <w:p>
+            <w:pPr>
+              <w:spacing w:after="0" w:line="250"/>
+            </w:pPr>
+            <w:r>
+              <w:rPr>
+                <w:color w:val="000000"/>
+                <w:sz w:val="20"/>
+                <w:szCs w:val="20"/>
+              </w:rPr>
+              <w:t xml:space="preserve">HU38</w:t>
+            </w:r>
+          </w:p>
+        </w:tc>
+        <w:tc>
+          <w:tcPr>
+            <w:tcW w:type="dxa" w:w="4700"/>
+            <w:shd w:fill="F2F5F9" w:val="clear"/>
+            <w:tcMar>
+              <w:top w:type="dxa" w:w="70"/>
+              <w:left w:type="dxa" w:w="110"/>
+              <w:bottom w:type="dxa" w:w="70"/>
+              <w:right w:type="dxa" w:w="110"/>
+            </w:tcMar>
+          </w:tcPr>
+          <w:p>
+            <w:pPr>
+              <w:spacing w:after="0" w:line="250"/>
+            </w:pPr>
+            <w:r>
+              <w:rPr>
+                <w:color w:val="000000"/>
+                <w:sz w:val="20"/>
+                <w:szCs w:val="20"/>
+              </w:rPr>
+              <w:t xml:space="preserve">Como ciudadano quiero navegar los incidentes por páginas para poder consultarlos todos y no solo los primeros.</w:t>
+            </w:r>
+          </w:p>
+        </w:tc>
+        <w:tc>
+          <w:tcPr>
+            <w:tcW w:type="dxa" w:w="1150"/>
+            <w:shd w:fill="F2F5F9" w:val="clear"/>
+            <w:tcMar>
+              <w:top w:type="dxa" w:w="70"/>
+              <w:left w:type="dxa" w:w="110"/>
+              <w:bottom w:type="dxa" w:w="70"/>
+              <w:right w:type="dxa" w:w="110"/>
+            </w:tcMar>
+          </w:tcPr>
+          <w:p>
+            <w:pPr>
+              <w:spacing w:after="0" w:line="250"/>
+            </w:pPr>
+            <w:r>
+              <w:rPr>
+                <w:color w:val="000000"/>
+                <w:sz w:val="20"/>
+                <w:szCs w:val="20"/>
+              </w:rPr>
+              <w:t xml:space="preserve">Media</w:t>
+            </w:r>
+          </w:p>
+        </w:tc>
+        <w:tc>
+          <w:tcPr>
+            <w:tcW w:type="dxa" w:w="2276"/>
+            <w:shd w:fill="F2F5F9" w:val="clear"/>
+            <w:tcMar>
+              <w:top w:type="dxa" w:w="70"/>
+              <w:left w:type="dxa" w:w="110"/>
+              <w:bottom w:type="dxa" w:w="70"/>
+              <w:right w:type="dxa" w:w="110"/>
+            </w:tcMar>
+          </w:tcPr>
+          <w:p>
+            <w:pPr>
+              <w:spacing w:after="0" w:line="250"/>
+            </w:pPr>
+            <w:r>
+              <w:rPr>
+                <w:color w:val="000000"/>
+                <w:sz w:val="20"/>
+                <w:szCs w:val="20"/>
+              </w:rPr>
+              <w:t xml:space="preserve">Implementada</w:t>
+            </w:r>
+          </w:p>
+        </w:tc>
+      </w:tr>
+      <w:tr>
+        <w:tc>
+          <w:tcPr>
+            <w:tcW w:type="dxa" w:w="900"/>
+            <w:shd w:fill="FFFFFF" w:val="clear"/>
+            <w:tcMar>
+              <w:top w:type="dxa" w:w="70"/>
+              <w:left w:type="dxa" w:w="110"/>
+              <w:bottom w:type="dxa" w:w="70"/>
+              <w:right w:type="dxa" w:w="110"/>
+            </w:tcMar>
+          </w:tcPr>
+          <w:p>
+            <w:pPr>
+              <w:spacing w:after="0" w:line="250"/>
+            </w:pPr>
+            <w:r>
+              <w:rPr>
+                <w:color w:val="000000"/>
+                <w:sz w:val="20"/>
+                <w:szCs w:val="20"/>
+              </w:rPr>
+              <w:t xml:space="preserve">HU39</w:t>
+            </w:r>
+          </w:p>
+        </w:tc>
+        <w:tc>
+          <w:tcPr>
+            <w:tcW w:type="dxa" w:w="4700"/>
+            <w:shd w:fill="FFFFFF" w:val="clear"/>
+            <w:tcMar>
+              <w:top w:type="dxa" w:w="70"/>
+              <w:left w:type="dxa" w:w="110"/>
+              <w:bottom w:type="dxa" w:w="70"/>
+              <w:right w:type="dxa" w:w="110"/>
+            </w:tcMar>
+          </w:tcPr>
+          <w:p>
+            <w:pPr>
+              <w:spacing w:after="0" w:line="250"/>
+            </w:pPr>
+            <w:r>
+              <w:rPr>
+                <w:color w:val="000000"/>
+                <w:sz w:val="20"/>
+                <w:szCs w:val="20"/>
+              </w:rPr>
+              <w:t xml:space="preserve">Como ciudadano quiero que mis reportes pendientes no sean visibles para otros vecinos hasta que sean validados.</w:t>
+            </w:r>
+          </w:p>
+        </w:tc>
+        <w:tc>
+          <w:tcPr>
+            <w:tcW w:type="dxa" w:w="1150"/>
+            <w:shd w:fill="FFFFFF" w:val="clear"/>
+            <w:tcMar>
+              <w:top w:type="dxa" w:w="70"/>
+              <w:left w:type="dxa" w:w="110"/>
+              <w:bottom w:type="dxa" w:w="70"/>
+              <w:right w:type="dxa" w:w="110"/>
+            </w:tcMar>
+          </w:tcPr>
+          <w:p>
+            <w:pPr>
+              <w:spacing w:after="0" w:line="250"/>
+            </w:pPr>
+            <w:r>
+              <w:rPr>
+                <w:color w:val="000000"/>
+                <w:sz w:val="20"/>
+                <w:szCs w:val="20"/>
+              </w:rPr>
+              <w:t xml:space="preserve">Alta</w:t>
+            </w:r>
+          </w:p>
+        </w:tc>
+        <w:tc>
+          <w:tcPr>
+            <w:tcW w:type="dxa" w:w="2276"/>
+            <w:shd w:fill="FFFFFF" w:val="clear"/>
             <w:tcMar>
               <w:top w:type="dxa" w:w="70"/>
               <w:left w:type="dxa" w:w="110"/>
@@ -9293,7 +9599,7 @@
                 <w:sz w:val="20"/>
                 <w:szCs w:val="20"/>
               </w:rPr>
-              <w:t xml:space="preserve">9. Scope público y pruebas</w:t>
+              <w:t xml:space="preserve">9. Scope público y Postman</w:t>
             </w:r>
           </w:p>
         </w:tc>
@@ -9318,7 +9624,7 @@
                 <w:sz w:val="20"/>
                 <w:szCs w:val="20"/>
               </w:rPr>
-              <w:t xml:space="preserve">API para consumo externo, paginación, colección Postman y pruebas integrales.</w:t>
+              <w:t xml:space="preserve">API para consumo externo, paginación y colección de pruebas de la API.</w:t>
             </w:r>
           </w:p>
         </w:tc>
@@ -9370,7 +9676,161 @@
                 <w:sz w:val="20"/>
                 <w:szCs w:val="20"/>
               </w:rPr>
-              <w:t xml:space="preserve">10. Documentación y cierre</w:t>
+              <w:t xml:space="preserve">10. Auditoría y pruebas</w:t>
+            </w:r>
+          </w:p>
+        </w:tc>
+        <w:tc>
+          <w:tcPr>
+            <w:tcW w:type="dxa" w:w="5226"/>
+            <w:shd w:fill="F2F5F9" w:val="clear"/>
+            <w:tcMar>
+              <w:top w:type="dxa" w:w="70"/>
+              <w:left w:type="dxa" w:w="110"/>
+              <w:bottom w:type="dxa" w:w="70"/>
+              <w:right w:type="dxa" w:w="110"/>
+            </w:tcMar>
+          </w:tcPr>
+          <w:p>
+            <w:pPr>
+              <w:spacing w:after="0" w:line="250"/>
+            </w:pPr>
+            <w:r>
+              <w:rPr>
+                <w:color w:val="000000"/>
+                <w:sz w:val="20"/>
+                <w:szCs w:val="20"/>
+              </w:rPr>
+              <w:t xml:space="preserve">Revisión de control de acceso, corrección de defectos y batería de pruebas automatizadas.</w:t>
+            </w:r>
+          </w:p>
+        </w:tc>
+        <w:tc>
+          <w:tcPr>
+            <w:tcW w:type="dxa" w:w="1700"/>
+            <w:shd w:fill="F2F5F9" w:val="clear"/>
+            <w:tcMar>
+              <w:top w:type="dxa" w:w="70"/>
+              <w:left w:type="dxa" w:w="110"/>
+              <w:bottom w:type="dxa" w:w="70"/>
+              <w:right w:type="dxa" w:w="110"/>
+            </w:tcMar>
+          </w:tcPr>
+          <w:p>
+            <w:pPr>
+              <w:spacing w:after="0" w:line="250"/>
+            </w:pPr>
+            <w:r>
+              <w:rPr>
+                <w:color w:val="000000"/>
+                <w:sz w:val="20"/>
+                <w:szCs w:val="20"/>
+              </w:rPr>
+              <w:t xml:space="preserve">1 semana</w:t>
+            </w:r>
+          </w:p>
+        </w:tc>
+      </w:tr>
+      <w:tr>
+        <w:tc>
+          <w:tcPr>
+            <w:tcW w:type="dxa" w:w="2100"/>
+            <w:shd w:fill="FFFFFF" w:val="clear"/>
+            <w:tcMar>
+              <w:top w:type="dxa" w:w="70"/>
+              <w:left w:type="dxa" w:w="110"/>
+              <w:bottom w:type="dxa" w:w="70"/>
+              <w:right w:type="dxa" w:w="110"/>
+            </w:tcMar>
+          </w:tcPr>
+          <w:p>
+            <w:pPr>
+              <w:spacing w:after="0" w:line="250"/>
+            </w:pPr>
+            <w:r>
+              <w:rPr>
+                <w:color w:val="000000"/>
+                <w:sz w:val="20"/>
+                <w:szCs w:val="20"/>
+              </w:rPr>
+              <w:t xml:space="preserve">11. Despliegue en la nube</w:t>
+            </w:r>
+          </w:p>
+        </w:tc>
+        <w:tc>
+          <w:tcPr>
+            <w:tcW w:type="dxa" w:w="5226"/>
+            <w:shd w:fill="FFFFFF" w:val="clear"/>
+            <w:tcMar>
+              <w:top w:type="dxa" w:w="70"/>
+              <w:left w:type="dxa" w:w="110"/>
+              <w:bottom w:type="dxa" w:w="70"/>
+              <w:right w:type="dxa" w:w="110"/>
+            </w:tcMar>
+          </w:tcPr>
+          <w:p>
+            <w:pPr>
+              <w:spacing w:after="0" w:line="250"/>
+            </w:pPr>
+            <w:r>
+              <w:rPr>
+                <w:color w:val="000000"/>
+                <w:sz w:val="20"/>
+                <w:szCs w:val="20"/>
+              </w:rPr>
+              <w:t xml:space="preserve">Publicación del repositorio, configuración de las plataformas y puesta en producción.</w:t>
+            </w:r>
+          </w:p>
+        </w:tc>
+        <w:tc>
+          <w:tcPr>
+            <w:tcW w:type="dxa" w:w="1700"/>
+            <w:shd w:fill="FFFFFF" w:val="clear"/>
+            <w:tcMar>
+              <w:top w:type="dxa" w:w="70"/>
+              <w:left w:type="dxa" w:w="110"/>
+              <w:bottom w:type="dxa" w:w="70"/>
+              <w:right w:type="dxa" w:w="110"/>
+            </w:tcMar>
+          </w:tcPr>
+          <w:p>
+            <w:pPr>
+              <w:spacing w:after="0" w:line="250"/>
+            </w:pPr>
+            <w:r>
+              <w:rPr>
+                <w:color w:val="000000"/>
+                <w:sz w:val="20"/>
+                <w:szCs w:val="20"/>
+              </w:rPr>
+              <w:t xml:space="preserve">1 semana</w:t>
+            </w:r>
+          </w:p>
+        </w:tc>
+      </w:tr>
+      <w:tr>
+        <w:tc>
+          <w:tcPr>
+            <w:tcW w:type="dxa" w:w="2100"/>
+            <w:shd w:fill="F2F5F9" w:val="clear"/>
+            <w:tcMar>
+              <w:top w:type="dxa" w:w="70"/>
+              <w:left w:type="dxa" w:w="110"/>
+              <w:bottom w:type="dxa" w:w="70"/>
+              <w:right w:type="dxa" w:w="110"/>
+            </w:tcMar>
+          </w:tcPr>
+          <w:p>
+            <w:pPr>
+              <w:spacing w:after="0" w:line="250"/>
+            </w:pPr>
+            <w:r>
+              <w:rPr>
+                <w:color w:val="000000"/>
+                <w:sz w:val="20"/>
+                <w:szCs w:val="20"/>
+              </w:rPr>
+              <w:t xml:space="preserve">12. Documentación y cierre</w:t>
             </w:r>
           </w:p>
         </w:tc>
@@ -9444,7 +9904,7 @@
           <w:sz w:val="22"/>
           <w:szCs w:val="22"/>
         </w:rPr>
-        <w:t xml:space="preserve">12 semanas de trabajo, sobre un esfuerzo estimado de 8 a 12 horas semanales.</w:t>
+        <w:t xml:space="preserve">14 semanas de trabajo, sobre un esfuerzo estimado de 8 a 12 horas semanales.</w:t>
       </w:r>
     </w:p>
     <w:p>
@@ -11172,6 +11632,237 @@
           <w:tcPr>
             <w:tcW w:type="dxa" w:w="1700"/>
             <w:shd w:fill="F2F5F9" w:val="clear"/>
+            <w:tcMar>
+              <w:top w:type="dxa" w:w="70"/>
+              <w:left w:type="dxa" w:w="110"/>
+              <w:bottom w:type="dxa" w:w="70"/>
+              <w:right w:type="dxa" w:w="110"/>
+            </w:tcMar>
+          </w:tcPr>
+          <w:p>
+            <w:pPr>
+              <w:spacing w:after="0" w:line="250"/>
+            </w:pPr>
+            <w:r>
+              <w:rPr>
+                <w:color w:val="000000"/>
+                <w:sz w:val="20"/>
+                <w:szCs w:val="20"/>
+              </w:rPr>
+              <w:t xml:space="preserve">Completa</w:t>
+            </w:r>
+          </w:p>
+        </w:tc>
+      </w:tr>
+      <w:tr>
+        <w:tc>
+          <w:tcPr>
+            <w:tcW w:type="dxa" w:w="2200"/>
+            <w:shd w:fill="FFFFFF" w:val="clear"/>
+            <w:tcMar>
+              <w:top w:type="dxa" w:w="70"/>
+              <w:left w:type="dxa" w:w="110"/>
+              <w:bottom w:type="dxa" w:w="70"/>
+              <w:right w:type="dxa" w:w="110"/>
+            </w:tcMar>
+          </w:tcPr>
+          <w:p>
+            <w:pPr>
+              <w:spacing w:after="0" w:line="250"/>
+            </w:pPr>
+            <w:r>
+              <w:rPr>
+                <w:color w:val="000000"/>
+                <w:sz w:val="20"/>
+                <w:szCs w:val="20"/>
+              </w:rPr>
+              <w:t xml:space="preserve">Búsqueda y paginación</w:t>
+            </w:r>
+          </w:p>
+        </w:tc>
+        <w:tc>
+          <w:tcPr>
+            <w:tcW w:type="dxa" w:w="5126"/>
+            <w:shd w:fill="FFFFFF" w:val="clear"/>
+            <w:tcMar>
+              <w:top w:type="dxa" w:w="70"/>
+              <w:left w:type="dxa" w:w="110"/>
+              <w:bottom w:type="dxa" w:w="70"/>
+              <w:right w:type="dxa" w:w="110"/>
+            </w:tcMar>
+          </w:tcPr>
+          <w:p>
+            <w:pPr>
+              <w:spacing w:after="0" w:line="250"/>
+            </w:pPr>
+            <w:r>
+              <w:rPr>
+                <w:color w:val="000000"/>
+                <w:sz w:val="20"/>
+                <w:szCs w:val="20"/>
+              </w:rPr>
+              <w:t xml:space="preserve">Búsqueda por título, descripción o dirección, y navegación paginada de los listados.</w:t>
+            </w:r>
+          </w:p>
+        </w:tc>
+        <w:tc>
+          <w:tcPr>
+            <w:tcW w:type="dxa" w:w="1700"/>
+            <w:shd w:fill="FFFFFF" w:val="clear"/>
+            <w:tcMar>
+              <w:top w:type="dxa" w:w="70"/>
+              <w:left w:type="dxa" w:w="110"/>
+              <w:bottom w:type="dxa" w:w="70"/>
+              <w:right w:type="dxa" w:w="110"/>
+            </w:tcMar>
+          </w:tcPr>
+          <w:p>
+            <w:pPr>
+              <w:spacing w:after="0" w:line="250"/>
+            </w:pPr>
+            <w:r>
+              <w:rPr>
+                <w:color w:val="000000"/>
+                <w:sz w:val="20"/>
+                <w:szCs w:val="20"/>
+              </w:rPr>
+              <w:t xml:space="preserve">Completa</w:t>
+            </w:r>
+          </w:p>
+        </w:tc>
+      </w:tr>
+      <w:tr>
+        <w:tc>
+          <w:tcPr>
+            <w:tcW w:type="dxa" w:w="2200"/>
+            <w:shd w:fill="F2F5F9" w:val="clear"/>
+            <w:tcMar>
+              <w:top w:type="dxa" w:w="70"/>
+              <w:left w:type="dxa" w:w="110"/>
+              <w:bottom w:type="dxa" w:w="70"/>
+              <w:right w:type="dxa" w:w="110"/>
+            </w:tcMar>
+          </w:tcPr>
+          <w:p>
+            <w:pPr>
+              <w:spacing w:after="0" w:line="250"/>
+            </w:pPr>
+            <w:r>
+              <w:rPr>
+                <w:color w:val="000000"/>
+                <w:sz w:val="20"/>
+                <w:szCs w:val="20"/>
+              </w:rPr>
+              <w:t xml:space="preserve">Pruebas automatizadas</w:t>
+            </w:r>
+          </w:p>
+        </w:tc>
+        <w:tc>
+          <w:tcPr>
+            <w:tcW w:type="dxa" w:w="5126"/>
+            <w:shd w:fill="F2F5F9" w:val="clear"/>
+            <w:tcMar>
+              <w:top w:type="dxa" w:w="70"/>
+              <w:left w:type="dxa" w:w="110"/>
+              <w:bottom w:type="dxa" w:w="70"/>
+              <w:right w:type="dxa" w:w="110"/>
+            </w:tcMar>
+          </w:tcPr>
+          <w:p>
+            <w:pPr>
+              <w:spacing w:after="0" w:line="250"/>
+            </w:pPr>
+            <w:r>
+              <w:rPr>
+                <w:color w:val="000000"/>
+                <w:sz w:val="20"/>
+                <w:szCs w:val="20"/>
+              </w:rPr>
+              <w:t xml:space="preserve">37 pruebas de integración sobre la API, ejecutables con un solo comando.</w:t>
+            </w:r>
+          </w:p>
+        </w:tc>
+        <w:tc>
+          <w:tcPr>
+            <w:tcW w:type="dxa" w:w="1700"/>
+            <w:shd w:fill="F2F5F9" w:val="clear"/>
+            <w:tcMar>
+              <w:top w:type="dxa" w:w="70"/>
+              <w:left w:type="dxa" w:w="110"/>
+              <w:bottom w:type="dxa" w:w="70"/>
+              <w:right w:type="dxa" w:w="110"/>
+            </w:tcMar>
+          </w:tcPr>
+          <w:p>
+            <w:pPr>
+              <w:spacing w:after="0" w:line="250"/>
+            </w:pPr>
+            <w:r>
+              <w:rPr>
+                <w:color w:val="000000"/>
+                <w:sz w:val="20"/>
+                <w:szCs w:val="20"/>
+              </w:rPr>
+              <w:t xml:space="preserve">Completa</w:t>
+            </w:r>
+          </w:p>
+        </w:tc>
+      </w:tr>
+      <w:tr>
+        <w:tc>
+          <w:tcPr>
+            <w:tcW w:type="dxa" w:w="2200"/>
+            <w:shd w:fill="FFFFFF" w:val="clear"/>
+            <w:tcMar>
+              <w:top w:type="dxa" w:w="70"/>
+              <w:left w:type="dxa" w:w="110"/>
+              <w:bottom w:type="dxa" w:w="70"/>
+              <w:right w:type="dxa" w:w="110"/>
+            </w:tcMar>
+          </w:tcPr>
+          <w:p>
+            <w:pPr>
+              <w:spacing w:after="0" w:line="250"/>
+            </w:pPr>
+            <w:r>
+              <w:rPr>
+                <w:color w:val="000000"/>
+                <w:sz w:val="20"/>
+                <w:szCs w:val="20"/>
+              </w:rPr>
+              <w:t xml:space="preserve">Despliegue en la nube</w:t>
+            </w:r>
+          </w:p>
+        </w:tc>
+        <w:tc>
+          <w:tcPr>
+            <w:tcW w:type="dxa" w:w="5126"/>
+            <w:shd w:fill="FFFFFF" w:val="clear"/>
+            <w:tcMar>
+              <w:top w:type="dxa" w:w="70"/>
+              <w:left w:type="dxa" w:w="110"/>
+              <w:bottom w:type="dxa" w:w="70"/>
+              <w:right w:type="dxa" w:w="110"/>
+            </w:tcMar>
+          </w:tcPr>
+          <w:p>
+            <w:pPr>
+              <w:spacing w:after="0" w:line="250"/>
+            </w:pPr>
+            <w:r>
+              <w:rPr>
+                <w:color w:val="000000"/>
+                <w:sz w:val="20"/>
+                <w:szCs w:val="20"/>
+              </w:rPr>
+              <w:t xml:space="preserve">Frontend y backend publicados en plataformas gestionadas, con base de datos en la nube.</w:t>
+            </w:r>
+          </w:p>
+        </w:tc>
+        <w:tc>
+          <w:tcPr>
+            <w:tcW w:type="dxa" w:w="1700"/>
+            <w:shd w:fill="FFFFFF" w:val="clear"/>
             <w:tcMar>
               <w:top w:type="dxa" w:w="70"/>
               <w:left w:type="dxa" w:w="110"/>
@@ -11310,7 +12001,7 @@
           <w:sz w:val="22"/>
           <w:szCs w:val="22"/>
         </w:rPr>
-        <w:t xml:space="preserve">Despliegue productivo en la nube con integración continua.</w:t>
+        <w:t xml:space="preserve">Pruebas automatizadas de extremo a extremo sobre la interfaz, que complementen las pruebas de la API.</w:t>
       </w:r>
     </w:p>
     <w:p>
@@ -12087,7 +12778,7 @@
                 <w:sz w:val="20"/>
                 <w:szCs w:val="20"/>
               </w:rPr>
-              <w:t xml:space="preserve">H9 — API pública y pruebas</w:t>
+              <w:t xml:space="preserve">H9 — API pública y Postman</w:t>
             </w:r>
           </w:p>
         </w:tc>
@@ -12112,7 +12803,7 @@
                 <w:sz w:val="20"/>
                 <w:szCs w:val="20"/>
               </w:rPr>
-              <w:t xml:space="preserve">Segundo scope documentado y colección Postman completa.</w:t>
+              <w:t xml:space="preserve">Segundo scope documentado y colección de pruebas completa.</w:t>
             </w:r>
           </w:p>
         </w:tc>
@@ -12164,7 +12855,7 @@
                 <w:sz w:val="20"/>
                 <w:szCs w:val="20"/>
               </w:rPr>
-              <w:t xml:space="preserve">H10 — Documentación y presentación</w:t>
+              <w:t xml:space="preserve">H10 — Auditoría y pruebas</w:t>
             </w:r>
           </w:p>
         </w:tc>
@@ -12189,6 +12880,160 @@
                 <w:sz w:val="20"/>
                 <w:szCs w:val="20"/>
               </w:rPr>
+              <w:t xml:space="preserve">Defectos de control de acceso corregidos y 37 pruebas automatizadas en verde.</w:t>
+            </w:r>
+          </w:p>
+        </w:tc>
+        <w:tc>
+          <w:tcPr>
+            <w:tcW w:type="dxa" w:w="1000"/>
+            <w:shd w:fill="F2F5F9" w:val="clear"/>
+            <w:tcMar>
+              <w:top w:type="dxa" w:w="70"/>
+              <w:left w:type="dxa" w:w="110"/>
+              <w:bottom w:type="dxa" w:w="70"/>
+              <w:right w:type="dxa" w:w="110"/>
+            </w:tcMar>
+          </w:tcPr>
+          <w:p>
+            <w:pPr>
+              <w:spacing w:after="0" w:line="250"/>
+            </w:pPr>
+            <w:r>
+              <w:rPr>
+                <w:color w:val="000000"/>
+                <w:sz w:val="20"/>
+                <w:szCs w:val="20"/>
+              </w:rPr>
+              <w:t xml:space="preserve">12</w:t>
+            </w:r>
+          </w:p>
+        </w:tc>
+      </w:tr>
+      <w:tr>
+        <w:tc>
+          <w:tcPr>
+            <w:tcW w:type="dxa" w:w="2600"/>
+            <w:shd w:fill="FFFFFF" w:val="clear"/>
+            <w:tcMar>
+              <w:top w:type="dxa" w:w="70"/>
+              <w:left w:type="dxa" w:w="110"/>
+              <w:bottom w:type="dxa" w:w="70"/>
+              <w:right w:type="dxa" w:w="110"/>
+            </w:tcMar>
+          </w:tcPr>
+          <w:p>
+            <w:pPr>
+              <w:spacing w:after="0" w:line="250"/>
+            </w:pPr>
+            <w:r>
+              <w:rPr>
+                <w:color w:val="000000"/>
+                <w:sz w:val="20"/>
+                <w:szCs w:val="20"/>
+              </w:rPr>
+              <w:t xml:space="preserve">H11 — Sistema en producción</w:t>
+            </w:r>
+          </w:p>
+        </w:tc>
+        <w:tc>
+          <w:tcPr>
+            <w:tcW w:type="dxa" w:w="5426"/>
+            <w:shd w:fill="FFFFFF" w:val="clear"/>
+            <w:tcMar>
+              <w:top w:type="dxa" w:w="70"/>
+              <w:left w:type="dxa" w:w="110"/>
+              <w:bottom w:type="dxa" w:w="70"/>
+              <w:right w:type="dxa" w:w="110"/>
+            </w:tcMar>
+          </w:tcPr>
+          <w:p>
+            <w:pPr>
+              <w:spacing w:after="0" w:line="250"/>
+            </w:pPr>
+            <w:r>
+              <w:rPr>
+                <w:color w:val="000000"/>
+                <w:sz w:val="20"/>
+                <w:szCs w:val="20"/>
+              </w:rPr>
+              <w:t xml:space="preserve">Aplicación accesible públicamente desde una URL.</w:t>
+            </w:r>
+          </w:p>
+        </w:tc>
+        <w:tc>
+          <w:tcPr>
+            <w:tcW w:type="dxa" w:w="1000"/>
+            <w:shd w:fill="FFFFFF" w:val="clear"/>
+            <w:tcMar>
+              <w:top w:type="dxa" w:w="70"/>
+              <w:left w:type="dxa" w:w="110"/>
+              <w:bottom w:type="dxa" w:w="70"/>
+              <w:right w:type="dxa" w:w="110"/>
+            </w:tcMar>
+          </w:tcPr>
+          <w:p>
+            <w:pPr>
+              <w:spacing w:after="0" w:line="250"/>
+            </w:pPr>
+            <w:r>
+              <w:rPr>
+                <w:color w:val="000000"/>
+                <w:sz w:val="20"/>
+                <w:szCs w:val="20"/>
+              </w:rPr>
+              <w:t xml:space="preserve">13</w:t>
+            </w:r>
+          </w:p>
+        </w:tc>
+      </w:tr>
+      <w:tr>
+        <w:tc>
+          <w:tcPr>
+            <w:tcW w:type="dxa" w:w="2600"/>
+            <w:shd w:fill="F2F5F9" w:val="clear"/>
+            <w:tcMar>
+              <w:top w:type="dxa" w:w="70"/>
+              <w:left w:type="dxa" w:w="110"/>
+              <w:bottom w:type="dxa" w:w="70"/>
+              <w:right w:type="dxa" w:w="110"/>
+            </w:tcMar>
+          </w:tcPr>
+          <w:p>
+            <w:pPr>
+              <w:spacing w:after="0" w:line="250"/>
+            </w:pPr>
+            <w:r>
+              <w:rPr>
+                <w:color w:val="000000"/>
+                <w:sz w:val="20"/>
+                <w:szCs w:val="20"/>
+              </w:rPr>
+              <w:t xml:space="preserve">H12 — Documentación y presentación</w:t>
+            </w:r>
+          </w:p>
+        </w:tc>
+        <w:tc>
+          <w:tcPr>
+            <w:tcW w:type="dxa" w:w="5426"/>
+            <w:shd w:fill="F2F5F9" w:val="clear"/>
+            <w:tcMar>
+              <w:top w:type="dxa" w:w="70"/>
+              <w:left w:type="dxa" w:w="110"/>
+              <w:bottom w:type="dxa" w:w="70"/>
+              <w:right w:type="dxa" w:w="110"/>
+            </w:tcMar>
+          </w:tcPr>
+          <w:p>
+            <w:pPr>
+              <w:spacing w:after="0" w:line="250"/>
+            </w:pPr>
+            <w:r>
+              <w:rPr>
+                <w:color w:val="000000"/>
+                <w:sz w:val="20"/>
+                <w:szCs w:val="20"/>
+              </w:rPr>
               <w:t xml:space="preserve">Documentación técnica y de gestión finalizada.</w:t>
             </w:r>
           </w:p>
@@ -12214,7 +13059,7 @@
                 <w:sz w:val="20"/>
                 <w:szCs w:val="20"/>
               </w:rPr>
-              <w:t xml:space="preserve">12</w:t>
+              <w:t xml:space="preserve">14</w:t>
             </w:r>
           </w:p>
         </w:tc>
@@ -12418,6 +13263,23 @@
           <w:sz w:val="22"/>
           <w:szCs w:val="22"/>
         </w:rPr>
+        <w:t xml:space="preserve">Batería de 37 pruebas automatizadas de integración, ejecutables con un único comando, que cubren la autorización por rol, la visibilidad del contenido, el circuito de moderación, la paginación y el scope público.</w:t>
+      </w:r>
+    </w:p>
+    <w:p>
+      <w:pPr>
+        <w:pStyle w:val="ListParagraph"/>
+        <w:numPr>
+          <w:ilvl w:val="0"/>
+          <w:numId w:val="2"/>
+        </w:numPr>
+        <w:spacing w:after="70" w:line="276"/>
+      </w:pPr>
+      <w:r>
+        <w:rPr>
+          <w:sz w:val="22"/>
+          <w:szCs w:val="22"/>
+        </w:rPr>
         <w:t xml:space="preserve">Colección de Postman con los endpoints de ambos scopes, organizados por módulo funcional.</w:t>
       </w:r>
     </w:p>
@@ -12453,6 +13315,118 @@
           <w:szCs w:val="22"/>
         </w:rPr>
         <w:t xml:space="preserve">Verificación manual del comportamiento esperado ante credenciales ausentes, inválidas o con rol insuficiente.</w:t>
+      </w:r>
+    </w:p>
+    <w:p>
+      <w:pPr>
+        <w:shd w:fill="F2F5F9" w:val="clear"/>
+        <w:spacing w:after="40" w:line="240"/>
+        <w:ind w:left="220"/>
+      </w:pPr>
+      <w:r>
+        <w:rPr>
+          <w:rFonts w:ascii="Consolas" w:cs="Consolas" w:eastAsia="Consolas" w:hAnsi="Consolas"/>
+          <w:sz w:val="19"/>
+          <w:szCs w:val="19"/>
+        </w:rPr>
+        <w:t xml:space="preserve">$ npm test</w:t>
+      </w:r>
+    </w:p>
+    <w:p>
+      <w:pPr>
+        <w:shd w:fill="F2F5F9" w:val="clear"/>
+        <w:spacing w:after="40" w:line="240"/>
+        <w:ind w:left="220"/>
+      </w:pPr>
+      <w:r>
+        <w:rPr>
+          <w:rFonts w:ascii="Consolas" w:cs="Consolas" w:eastAsia="Consolas" w:hAnsi="Consolas"/>
+          <w:sz w:val="19"/>
+          <w:szCs w:val="19"/>
+        </w:rPr>
+        <w:t xml:space="preserve">Test Files  2 passed (2)</w:t>
+      </w:r>
+    </w:p>
+    <w:p>
+      <w:pPr>
+        <w:shd w:fill="F2F5F9" w:val="clear"/>
+        <w:spacing w:after="40" w:line="240"/>
+        <w:ind w:left="220"/>
+      </w:pPr>
+      <w:r>
+        <w:rPr>
+          <w:rFonts w:ascii="Consolas" w:cs="Consolas" w:eastAsia="Consolas" w:hAnsi="Consolas"/>
+          <w:sz w:val="19"/>
+          <w:szCs w:val="19"/>
+        </w:rPr>
+        <w:t xml:space="preserve">     Tests  37 passed (37)</w:t>
+      </w:r>
+    </w:p>
+    <w:p>
+      <w:pPr>
+        <w:pStyle w:val="Heading3"/>
+        <w:spacing w:after="110" w:before="220"/>
+      </w:pPr>
+      <w:r>
+        <w:rPr>
+          <w:b/>
+          <w:bCs/>
+          <w:color w:val="2E5C8A"/>
+          <w:sz w:val="23"/>
+          <w:szCs w:val="23"/>
+        </w:rPr>
+        <w:t xml:space="preserve">Repositorio y despliegue continuo</w:t>
+      </w:r>
+    </w:p>
+    <w:p>
+      <w:pPr>
+        <w:pStyle w:val="ListParagraph"/>
+        <w:numPr>
+          <w:ilvl w:val="0"/>
+          <w:numId w:val="2"/>
+        </w:numPr>
+        <w:spacing w:after="70" w:line="276"/>
+      </w:pPr>
+      <w:r>
+        <w:rPr>
+          <w:sz w:val="22"/>
+          <w:szCs w:val="22"/>
+        </w:rPr>
+        <w:t xml:space="preserve">Código versionado en un repositorio Git público, que actúa como fuente única para las plataformas de despliegue.</w:t>
+      </w:r>
+    </w:p>
+    <w:p>
+      <w:pPr>
+        <w:pStyle w:val="ListParagraph"/>
+        <w:numPr>
+          <w:ilvl w:val="0"/>
+          <w:numId w:val="2"/>
+        </w:numPr>
+        <w:spacing w:after="70" w:line="276"/>
+      </w:pPr>
+      <w:r>
+        <w:rPr>
+          <w:sz w:val="22"/>
+          <w:szCs w:val="22"/>
+        </w:rPr>
+        <w:t xml:space="preserve">El frontend y el backend se reconstruyen automáticamente ante cada cambio publicado en el repositorio.</w:t>
+      </w:r>
+    </w:p>
+    <w:p>
+      <w:pPr>
+        <w:pStyle w:val="ListParagraph"/>
+        <w:numPr>
+          <w:ilvl w:val="0"/>
+          <w:numId w:val="2"/>
+        </w:numPr>
+        <w:spacing w:after="70" w:line="276"/>
+      </w:pPr>
+      <w:r>
+        <w:rPr>
+          <w:sz w:val="22"/>
+          <w:szCs w:val="22"/>
+        </w:rPr>
+        <w:t xml:space="preserve">Las credenciales de producción se cargan en el panel de cada plataforma y nunca se versionan.</w:t>
       </w:r>
     </w:p>
     <w:p>
@@ -13786,6 +14760,387 @@
                 <w:szCs w:val="18"/>
               </w:rPr>
               <w:t xml:space="preserve">Mitigado: el reporte se crea igualmente y se marca para revisión del moderador.</w:t>
+            </w:r>
+          </w:p>
+        </w:tc>
+      </w:tr>
+      <w:tr>
+        <w:tc>
+          <w:tcPr>
+            <w:tcW w:type="dxa" w:w="1900"/>
+            <w:shd w:fill="F2F5F9" w:val="clear"/>
+            <w:tcMar>
+              <w:top w:type="dxa" w:w="70"/>
+              <w:left w:type="dxa" w:w="110"/>
+              <w:bottom w:type="dxa" w:w="70"/>
+              <w:right w:type="dxa" w:w="110"/>
+            </w:tcMar>
+          </w:tcPr>
+          <w:p>
+            <w:pPr>
+              <w:spacing w:after="0" w:line="250"/>
+            </w:pPr>
+            <w:r>
+              <w:rPr>
+                <w:color w:val="000000"/>
+                <w:sz w:val="18"/>
+                <w:szCs w:val="18"/>
+              </w:rPr>
+              <w:t xml:space="preserve">Acceso indebido a contenido no moderado o a datos personales</w:t>
+            </w:r>
+          </w:p>
+        </w:tc>
+        <w:tc>
+          <w:tcPr>
+            <w:tcW w:type="dxa" w:w="700"/>
+            <w:shd w:fill="F2F5F9" w:val="clear"/>
+            <w:tcMar>
+              <w:top w:type="dxa" w:w="70"/>
+              <w:left w:type="dxa" w:w="110"/>
+              <w:bottom w:type="dxa" w:w="70"/>
+              <w:right w:type="dxa" w:w="110"/>
+            </w:tcMar>
+          </w:tcPr>
+          <w:p>
+            <w:pPr>
+              <w:spacing w:after="0" w:line="250"/>
+            </w:pPr>
+            <w:r>
+              <w:rPr>
+                <w:color w:val="000000"/>
+                <w:sz w:val="18"/>
+                <w:szCs w:val="18"/>
+              </w:rPr>
+              <w:t xml:space="preserve">Media</w:t>
+            </w:r>
+          </w:p>
+        </w:tc>
+        <w:tc>
+          <w:tcPr>
+            <w:tcW w:type="dxa" w:w="800"/>
+            <w:shd w:fill="F2F5F9" w:val="clear"/>
+            <w:tcMar>
+              <w:top w:type="dxa" w:w="70"/>
+              <w:left w:type="dxa" w:w="110"/>
+              <w:bottom w:type="dxa" w:w="70"/>
+              <w:right w:type="dxa" w:w="110"/>
+            </w:tcMar>
+          </w:tcPr>
+          <w:p>
+            <w:pPr>
+              <w:spacing w:after="0" w:line="250"/>
+            </w:pPr>
+            <w:r>
+              <w:rPr>
+                <w:color w:val="000000"/>
+                <w:sz w:val="18"/>
+                <w:szCs w:val="18"/>
+              </w:rPr>
+              <w:t xml:space="preserve">Alto</w:t>
+            </w:r>
+          </w:p>
+        </w:tc>
+        <w:tc>
+          <w:tcPr>
+            <w:tcW w:type="dxa" w:w="2900"/>
+            <w:shd w:fill="F2F5F9" w:val="clear"/>
+            <w:tcMar>
+              <w:top w:type="dxa" w:w="70"/>
+              <w:left w:type="dxa" w:w="110"/>
+              <w:bottom w:type="dxa" w:w="70"/>
+              <w:right w:type="dxa" w:w="110"/>
+            </w:tcMar>
+          </w:tcPr>
+          <w:p>
+            <w:pPr>
+              <w:spacing w:after="0" w:line="250"/>
+            </w:pPr>
+            <w:r>
+              <w:rPr>
+                <w:color w:val="000000"/>
+                <w:sz w:val="18"/>
+                <w:szCs w:val="18"/>
+              </w:rPr>
+              <w:t xml:space="preserve">Revisión específica de la capa de control de acceso una vez completado el alcance funcional.</w:t>
+            </w:r>
+          </w:p>
+        </w:tc>
+        <w:tc>
+          <w:tcPr>
+            <w:tcW w:type="dxa" w:w="2726"/>
+            <w:shd w:fill="F2F5F9" w:val="clear"/>
+            <w:tcMar>
+              <w:top w:type="dxa" w:w="70"/>
+              <w:left w:type="dxa" w:w="110"/>
+              <w:bottom w:type="dxa" w:w="70"/>
+              <w:right w:type="dxa" w:w="110"/>
+            </w:tcMar>
+          </w:tcPr>
+          <w:p>
+            <w:pPr>
+              <w:spacing w:after="0" w:line="250"/>
+            </w:pPr>
+            <w:r>
+              <w:rPr>
+                <w:color w:val="000000"/>
+                <w:sz w:val="18"/>
+                <w:szCs w:val="18"/>
+              </w:rPr>
+              <w:t xml:space="preserve">Materializado y resuelto: la auditoría detectó cuatro defectos, corregidos y cubiertos con pruebas automatizadas.</w:t>
+            </w:r>
+          </w:p>
+        </w:tc>
+      </w:tr>
+      <w:tr>
+        <w:tc>
+          <w:tcPr>
+            <w:tcW w:type="dxa" w:w="1900"/>
+            <w:shd w:fill="FFFFFF" w:val="clear"/>
+            <w:tcMar>
+              <w:top w:type="dxa" w:w="70"/>
+              <w:left w:type="dxa" w:w="110"/>
+              <w:bottom w:type="dxa" w:w="70"/>
+              <w:right w:type="dxa" w:w="110"/>
+            </w:tcMar>
+          </w:tcPr>
+          <w:p>
+            <w:pPr>
+              <w:spacing w:after="0" w:line="250"/>
+            </w:pPr>
+            <w:r>
+              <w:rPr>
+                <w:color w:val="000000"/>
+                <w:sz w:val="18"/>
+                <w:szCs w:val="18"/>
+              </w:rPr>
+              <w:t xml:space="preserve">Uso abusivo de la API o consumo excesivo de servicios de pago</w:t>
+            </w:r>
+          </w:p>
+        </w:tc>
+        <w:tc>
+          <w:tcPr>
+            <w:tcW w:type="dxa" w:w="700"/>
+            <w:shd w:fill="FFFFFF" w:val="clear"/>
+            <w:tcMar>
+              <w:top w:type="dxa" w:w="70"/>
+              <w:left w:type="dxa" w:w="110"/>
+              <w:bottom w:type="dxa" w:w="70"/>
+              <w:right w:type="dxa" w:w="110"/>
+            </w:tcMar>
+          </w:tcPr>
+          <w:p>
+            <w:pPr>
+              <w:spacing w:after="0" w:line="250"/>
+            </w:pPr>
+            <w:r>
+              <w:rPr>
+                <w:color w:val="000000"/>
+                <w:sz w:val="18"/>
+                <w:szCs w:val="18"/>
+              </w:rPr>
+              <w:t xml:space="preserve">Media</w:t>
+            </w:r>
+          </w:p>
+        </w:tc>
+        <w:tc>
+          <w:tcPr>
+            <w:tcW w:type="dxa" w:w="800"/>
+            <w:shd w:fill="FFFFFF" w:val="clear"/>
+            <w:tcMar>
+              <w:top w:type="dxa" w:w="70"/>
+              <w:left w:type="dxa" w:w="110"/>
+              <w:bottom w:type="dxa" w:w="70"/>
+              <w:right w:type="dxa" w:w="110"/>
+            </w:tcMar>
+          </w:tcPr>
+          <w:p>
+            <w:pPr>
+              <w:spacing w:after="0" w:line="250"/>
+            </w:pPr>
+            <w:r>
+              <w:rPr>
+                <w:color w:val="000000"/>
+                <w:sz w:val="18"/>
+                <w:szCs w:val="18"/>
+              </w:rPr>
+              <w:t xml:space="preserve">Medio</w:t>
+            </w:r>
+          </w:p>
+        </w:tc>
+        <w:tc>
+          <w:tcPr>
+            <w:tcW w:type="dxa" w:w="2900"/>
+            <w:shd w:fill="FFFFFF" w:val="clear"/>
+            <w:tcMar>
+              <w:top w:type="dxa" w:w="70"/>
+              <w:left w:type="dxa" w:w="110"/>
+              <w:bottom w:type="dxa" w:w="70"/>
+              <w:right w:type="dxa" w:w="110"/>
+            </w:tcMar>
+          </w:tcPr>
+          <w:p>
+            <w:pPr>
+              <w:spacing w:after="0" w:line="250"/>
+            </w:pPr>
+            <w:r>
+              <w:rPr>
+                <w:color w:val="000000"/>
+                <w:sz w:val="18"/>
+                <w:szCs w:val="18"/>
+              </w:rPr>
+              <w:t xml:space="preserve">Límite de peticiones por ventana de tiempo y tope máximo en el tamaño de página.</w:t>
+            </w:r>
+          </w:p>
+        </w:tc>
+        <w:tc>
+          <w:tcPr>
+            <w:tcW w:type="dxa" w:w="2726"/>
+            <w:shd w:fill="FFFFFF" w:val="clear"/>
+            <w:tcMar>
+              <w:top w:type="dxa" w:w="70"/>
+              <w:left w:type="dxa" w:w="110"/>
+              <w:bottom w:type="dxa" w:w="70"/>
+              <w:right w:type="dxa" w:w="110"/>
+            </w:tcMar>
+          </w:tcPr>
+          <w:p>
+            <w:pPr>
+              <w:spacing w:after="0" w:line="250"/>
+            </w:pPr>
+            <w:r>
+              <w:rPr>
+                <w:color w:val="000000"/>
+                <w:sz w:val="18"/>
+                <w:szCs w:val="18"/>
+              </w:rPr>
+              <w:t xml:space="preserve">Mitigado: límites diferenciados por scope, más estrictos en el alta de incidentes.</w:t>
+            </w:r>
+          </w:p>
+        </w:tc>
+      </w:tr>
+      <w:tr>
+        <w:tc>
+          <w:tcPr>
+            <w:tcW w:type="dxa" w:w="1900"/>
+            <w:shd w:fill="F2F5F9" w:val="clear"/>
+            <w:tcMar>
+              <w:top w:type="dxa" w:w="70"/>
+              <w:left w:type="dxa" w:w="110"/>
+              <w:bottom w:type="dxa" w:w="70"/>
+              <w:right w:type="dxa" w:w="110"/>
+            </w:tcMar>
+          </w:tcPr>
+          <w:p>
+            <w:pPr>
+              <w:spacing w:after="0" w:line="250"/>
+            </w:pPr>
+            <w:r>
+              <w:rPr>
+                <w:color w:val="000000"/>
+                <w:sz w:val="18"/>
+                <w:szCs w:val="18"/>
+              </w:rPr>
+              <w:t xml:space="preserve">Regresión de defectos ya corregidos</w:t>
+            </w:r>
+          </w:p>
+        </w:tc>
+        <w:tc>
+          <w:tcPr>
+            <w:tcW w:type="dxa" w:w="700"/>
+            <w:shd w:fill="F2F5F9" w:val="clear"/>
+            <w:tcMar>
+              <w:top w:type="dxa" w:w="70"/>
+              <w:left w:type="dxa" w:w="110"/>
+              <w:bottom w:type="dxa" w:w="70"/>
+              <w:right w:type="dxa" w:w="110"/>
+            </w:tcMar>
+          </w:tcPr>
+          <w:p>
+            <w:pPr>
+              <w:spacing w:after="0" w:line="250"/>
+            </w:pPr>
+            <w:r>
+              <w:rPr>
+                <w:color w:val="000000"/>
+                <w:sz w:val="18"/>
+                <w:szCs w:val="18"/>
+              </w:rPr>
+              <w:t xml:space="preserve">Alta</w:t>
+            </w:r>
+          </w:p>
+        </w:tc>
+        <w:tc>
+          <w:tcPr>
+            <w:tcW w:type="dxa" w:w="800"/>
+            <w:shd w:fill="F2F5F9" w:val="clear"/>
+            <w:tcMar>
+              <w:top w:type="dxa" w:w="70"/>
+              <w:left w:type="dxa" w:w="110"/>
+              <w:bottom w:type="dxa" w:w="70"/>
+              <w:right w:type="dxa" w:w="110"/>
+            </w:tcMar>
+          </w:tcPr>
+          <w:p>
+            <w:pPr>
+              <w:spacing w:after="0" w:line="250"/>
+            </w:pPr>
+            <w:r>
+              <w:rPr>
+                <w:color w:val="000000"/>
+                <w:sz w:val="18"/>
+                <w:szCs w:val="18"/>
+              </w:rPr>
+              <w:t xml:space="preserve">Medio</w:t>
+            </w:r>
+          </w:p>
+        </w:tc>
+        <w:tc>
+          <w:tcPr>
+            <w:tcW w:type="dxa" w:w="2900"/>
+            <w:shd w:fill="F2F5F9" w:val="clear"/>
+            <w:tcMar>
+              <w:top w:type="dxa" w:w="70"/>
+              <w:left w:type="dxa" w:w="110"/>
+              <w:bottom w:type="dxa" w:w="70"/>
+              <w:right w:type="dxa" w:w="110"/>
+            </w:tcMar>
+          </w:tcPr>
+          <w:p>
+            <w:pPr>
+              <w:spacing w:after="0" w:line="250"/>
+            </w:pPr>
+            <w:r>
+              <w:rPr>
+                <w:color w:val="000000"/>
+                <w:sz w:val="18"/>
+                <w:szCs w:val="18"/>
+              </w:rPr>
+              <w:t xml:space="preserve">Batería de pruebas automatizadas que cubre los defectos detectados.</w:t>
+            </w:r>
+          </w:p>
+        </w:tc>
+        <w:tc>
+          <w:tcPr>
+            <w:tcW w:type="dxa" w:w="2726"/>
+            <w:shd w:fill="F2F5F9" w:val="clear"/>
+            <w:tcMar>
+              <w:top w:type="dxa" w:w="70"/>
+              <w:left w:type="dxa" w:w="110"/>
+              <w:bottom w:type="dxa" w:w="70"/>
+              <w:right w:type="dxa" w:w="110"/>
+            </w:tcMar>
+          </w:tcPr>
+          <w:p>
+            <w:pPr>
+              <w:spacing w:after="0" w:line="250"/>
+            </w:pPr>
+            <w:r>
+              <w:rPr>
+                <w:color w:val="000000"/>
+                <w:sz w:val="18"/>
+                <w:szCs w:val="18"/>
+              </w:rPr>
+              <w:t xml:space="preserve">Mitigado: 37 pruebas de integración, validadas revirtiendo cada corrección para comprobar que fallaran.</w:t>
             </w:r>
           </w:p>
         </w:tc>

</xml_diff>